<commit_message>
Restore the hanging indent on references in the tracked-changes document
Reference entries carry the Bibliography paragraph style in the manuscript,
which is where their hanging indent comes from. That marker is lost converting
docx -> markdown, so the redline was writing them back as ordinary body text:
the manuscript had 53 Bibliography-styled paragraphs and the redline none.

The reference block is now wrapped in a div with custom-style="Bibliography",
so pandoc's docx writer applies the style again and picks up the indent defined
in RPE_reference.docx.

Also includes Adam's edits to the response letter.

Co-Authored-By: Claude Opus 5 <noreply@anthropic.com>
</commit_message>
<xml_diff>
--- a/RPE_Paper_tracked_changes.docx
+++ b/RPE_Paper_tracked_changes.docx
@@ -8436,7 +8436,7 @@
     </w:p>
     <w:p>
       <w:pPr>
-        <w:pStyle w:val="FirstParagraph"/>
+        <w:pStyle w:val="Bibliography"/>
       </w:pPr>
       <w:r>
         <w:t xml:space="preserve">Allen, Rebecca, Simon Burgess, and Jennifer Mayo. 2018.</w:t>
@@ -8480,7 +8480,7 @@
     </w:p>
     <w:p>
       <w:pPr>
-        <w:pStyle w:val="BodyText"/>
+        <w:pStyle w:val="Bibliography"/>
       </w:pPr>
       <w:r>
         <w:t xml:space="preserve">Allen, Rebecca, Simon Burgess, and Leigh McKenna. 2013.</w:t>
@@ -8524,7 +8524,7 @@
     </w:p>
     <w:p>
       <w:pPr>
-        <w:pStyle w:val="BodyText"/>
+        <w:pStyle w:val="Bibliography"/>
       </w:pPr>
       <w:r>
         <w:t xml:space="preserve">Anders, Jake, Francis Green, Morag Henderson, and Golo Henseke. 2024.</w:t>
@@ -8568,7 +8568,7 @@
     </w:p>
     <w:p>
       <w:pPr>
-        <w:pStyle w:val="BodyText"/>
+        <w:pStyle w:val="Bibliography"/>
       </w:pPr>
       <w:r>
         <w:t xml:space="preserve">Blagg, Kristin, Victoria Rosenboom, and Matthew M. Chingos. 2018.</w:t>
@@ -8603,7 +8603,7 @@
     </w:p>
     <w:p>
       <w:pPr>
-        <w:pStyle w:val="BodyText"/>
+        <w:pStyle w:val="Bibliography"/>
       </w:pPr>
       <w:r>
         <w:t xml:space="preserve">Burgess, Simon, Claire Crawford, and Lindsey Macmillan. 2018.</w:t>
@@ -8647,7 +8647,7 @@
     </w:p>
     <w:p>
       <w:pPr>
-        <w:pStyle w:val="BodyText"/>
+        <w:pStyle w:val="Bibliography"/>
       </w:pPr>
       <w:del w:id="233" w:author="Revision" w:date="2026-08-25T00:00:00Z">
         <w:r>
@@ -8684,7 +8684,7 @@
     </w:p>
     <w:p>
       <w:pPr>
-        <w:pStyle w:val="BodyText"/>
+        <w:pStyle w:val="Bibliography"/>
       </w:pPr>
       <w:r>
         <w:t xml:space="preserve">Burgess, Simon, Shenila Rawal, and Eric S. Taylor. 2023.</w:t>
@@ -8728,7 +8728,7 @@
     </w:p>
     <w:p>
       <w:pPr>
-        <w:pStyle w:val="BodyText"/>
+        <w:pStyle w:val="Bibliography"/>
       </w:pPr>
       <w:r>
         <w:t xml:space="preserve">Chairassamee, Nattanicha, Kanokwan Chancharoenchai, and Wuthiya Saraithong. 2024.</w:t>
@@ -8772,7 +8772,7 @@
     </w:p>
     <w:p>
       <w:pPr>
-        <w:pStyle w:val="BodyText"/>
+        <w:pStyle w:val="Bibliography"/>
       </w:pPr>
       <w:ins w:id="261" w:author="Revision" w:date="2026-08-25T00:00:00Z">
         <w:r>
@@ -8795,7 +8795,7 @@
     </w:p>
     <w:p>
       <w:pPr>
-        <w:pStyle w:val="BodyText"/>
+        <w:pStyle w:val="Bibliography"/>
       </w:pPr>
       <w:r>
         <w:t xml:space="preserve">Commons Education Committee, House of. 2021.</w:t>
@@ -8844,7 +8844,7 @@
     </w:p>
     <w:p>
       <w:pPr>
-        <w:pStyle w:val="BodyText"/>
+        <w:pStyle w:val="Bibliography"/>
       </w:pPr>
       <w:r>
         <w:t xml:space="preserve">Cordes, Sarah A., Christopher Rick, and Amy Ellen Schwartz. 2022.</w:t>
@@ -8888,7 +8888,7 @@
     </w:p>
     <w:p>
       <w:pPr>
-        <w:pStyle w:val="BodyText"/>
+        <w:pStyle w:val="Bibliography"/>
       </w:pPr>
       <w:r>
         <w:t xml:space="preserve">DfE. 2022.</w:t>
@@ -8923,7 +8923,7 @@
     </w:p>
     <w:p>
       <w:pPr>
-        <w:pStyle w:val="BodyText"/>
+        <w:pStyle w:val="Bibliography"/>
       </w:pPr>
       <w:r>
         <w:t xml:space="preserve">DfE. 2025a.</w:t>
@@ -8958,7 +8958,7 @@
     </w:p>
     <w:p>
       <w:pPr>
-        <w:pStyle w:val="BodyText"/>
+        <w:pStyle w:val="Bibliography"/>
       </w:pPr>
       <w:r>
         <w:t xml:space="preserve">DfE. 2025b.</w:t>
@@ -8993,7 +8993,7 @@
     </w:p>
     <w:p>
       <w:pPr>
-        <w:pStyle w:val="BodyText"/>
+        <w:pStyle w:val="Bibliography"/>
       </w:pPr>
       <w:r>
         <w:t xml:space="preserve">DfE. 2026.</w:t>
@@ -9028,7 +9028,7 @@
     </w:p>
     <w:p>
       <w:pPr>
-        <w:pStyle w:val="BodyText"/>
+        <w:pStyle w:val="Bibliography"/>
       </w:pPr>
       <w:r>
         <w:t xml:space="preserve">Ding, Peng, Yan Li, Suwei Feng, and Dorina Pojani. 2023.</w:t>
@@ -9072,7 +9072,7 @@
     </w:p>
     <w:p>
       <w:pPr>
-        <w:pStyle w:val="BodyText"/>
+        <w:pStyle w:val="Bibliography"/>
       </w:pPr>
       <w:r>
         <w:t xml:space="preserve">Dräger, Jascha, Markus Klein, and Edward Sosu. 2024.</w:t>
@@ -9116,7 +9116,7 @@
     </w:p>
     <w:p>
       <w:pPr>
-        <w:pStyle w:val="BodyText"/>
+        <w:pStyle w:val="Bibliography"/>
       </w:pPr>
       <w:r>
         <w:t xml:space="preserve">Farquharson, Christine, Sandra McNally, and Imran Tahir. 2024.</w:t>
@@ -9160,7 +9160,7 @@
     </w:p>
     <w:p>
       <w:pPr>
-        <w:pStyle w:val="BodyText"/>
+        <w:pStyle w:val="Bibliography"/>
       </w:pPr>
       <w:r>
         <w:t xml:space="preserve">Faulkner, Guy, Michelle Stone, Ron Buliung, Bonny Wong, and Raktim Mitra. 2013.</w:t>
@@ -9204,7 +9204,7 @@
     </w:p>
     <w:p>
       <w:pPr>
-        <w:pStyle w:val="BodyText"/>
+        <w:pStyle w:val="Bibliography"/>
       </w:pPr>
       <w:r>
         <w:t xml:space="preserve">Fredriksen, Katia, Jean Rhodes, Ranjini Reddy, and Niobe Way. 2004.</w:t>
@@ -9245,7 +9245,7 @@
     </w:p>
     <w:p>
       <w:pPr>
-        <w:pStyle w:val="BodyText"/>
+        <w:pStyle w:val="Bibliography"/>
       </w:pPr>
       <w:r>
         <w:t xml:space="preserve">Gibbons, Stephen, Vincenzo Scrutinio, and Shqiponja Telhaj. 2018.</w:t>
@@ -9283,7 +9283,7 @@
     </w:p>
     <w:p>
       <w:pPr>
-        <w:pStyle w:val="BodyText"/>
+        <w:pStyle w:val="Bibliography"/>
       </w:pPr>
       <w:r>
         <w:t xml:space="preserve">Gillborn, David, Sean Demack, Nicola Rollock, and Paul Warmington. 2017.</w:t>
@@ -9327,7 +9327,7 @@
     </w:p>
     <w:p>
       <w:pPr>
-        <w:pStyle w:val="BodyText"/>
+        <w:pStyle w:val="Bibliography"/>
       </w:pPr>
       <w:r>
         <w:t xml:space="preserve">Gorard, Stephen, and Nadia Siddiqui. 2019.</w:t>
@@ -9371,7 +9371,7 @@
     </w:p>
     <w:p>
       <w:pPr>
-        <w:pStyle w:val="BodyText"/>
+        <w:pStyle w:val="Bibliography"/>
       </w:pPr>
       <w:r>
         <w:t xml:space="preserve">Gorard, Stephen, Nadia Siddiqui, Beng Huat See, and Yiyang Gao. 2025.</w:t>
@@ -9415,7 +9415,7 @@
     </w:p>
     <w:p>
       <w:pPr>
-        <w:pStyle w:val="BodyText"/>
+        <w:pStyle w:val="Bibliography"/>
       </w:pPr>
       <w:r>
         <w:t xml:space="preserve">Grant, Catherine. 2017.</w:t>
@@ -9450,7 +9450,7 @@
     </w:p>
     <w:p>
       <w:pPr>
-        <w:pStyle w:val="BodyText"/>
+        <w:pStyle w:val="Bibliography"/>
       </w:pPr>
       <w:r>
         <w:t xml:space="preserve">Guan, Hongwei, Jingjing Xue, Yaqi Zhang, Fang Chang, and Wei Liu. 2025.</w:t>
@@ -9494,7 +9494,7 @@
     </w:p>
     <w:p>
       <w:pPr>
-        <w:pStyle w:val="BodyText"/>
+        <w:pStyle w:val="Bibliography"/>
       </w:pPr>
       <w:ins w:id="262" w:author="Revision" w:date="2026-08-25T00:00:00Z">
         <w:r>
@@ -9540,7 +9540,7 @@
     </w:p>
     <w:p>
       <w:pPr>
-        <w:pStyle w:val="BodyText"/>
+        <w:pStyle w:val="Bibliography"/>
       </w:pPr>
       <w:r>
         <w:t xml:space="preserve">Karan, Maira, Danny Rahal, David M. Almeida, et al. 2021.</w:t>
@@ -9584,7 +9584,7 @@
     </w:p>
     <w:p>
       <w:pPr>
-        <w:pStyle w:val="BodyText"/>
+        <w:pStyle w:val="Bibliography"/>
       </w:pPr>
       <w:r>
         <w:t xml:space="preserve">Macleod, S., C. Sharp, D. Bernardinelli, A. Skipp, and S. Higgins. 2015.</w:t>
@@ -9619,7 +9619,7 @@
     </w:p>
     <w:p>
       <w:pPr>
-        <w:pStyle w:val="BodyText"/>
+        <w:pStyle w:val="Bibliography"/>
       </w:pPr>
       <w:r>
         <w:t xml:space="preserve">Menzies, Loic. 2023.</w:t>
@@ -9663,7 +9663,7 @@
     </w:p>
     <w:p>
       <w:pPr>
-        <w:pStyle w:val="BodyText"/>
+        <w:pStyle w:val="Bibliography"/>
       </w:pPr>
       <w:ins w:id="263" w:author="Revision" w:date="2026-08-25T00:00:00Z">
         <w:r>
@@ -9700,7 +9700,7 @@
     </w:p>
     <w:p>
       <w:pPr>
-        <w:pStyle w:val="BodyText"/>
+        <w:pStyle w:val="Bibliography"/>
       </w:pPr>
       <w:r>
         <w:t xml:space="preserve">Nakagawa, Shinichi, Paul C. D. Johnson, and Holger Schielzeth. 2017.</w:t>
@@ -9744,7 +9744,7 @@
     </w:p>
     <w:p>
       <w:pPr>
-        <w:pStyle w:val="BodyText"/>
+        <w:pStyle w:val="Bibliography"/>
       </w:pPr>
       <w:r>
         <w:t xml:space="preserve">Nakagawa, Shinichi, and Holger Schielzeth. 2013.</w:t>
@@ -9788,7 +9788,7 @@
     </w:p>
     <w:p>
       <w:pPr>
-        <w:pStyle w:val="BodyText"/>
+        <w:pStyle w:val="Bibliography"/>
       </w:pPr>
       <w:r>
         <w:t xml:space="preserve">Nakajima, Sakurako, Yuichiro Otsuka, Osamu Itani, Yoshifumi Kaneko, Masato Suzuki, and Yoshitaka Kaneita. 2024.</w:t>
@@ -9832,7 +9832,7 @@
     </w:p>
     <w:p>
       <w:pPr>
-        <w:pStyle w:val="BodyText"/>
+        <w:pStyle w:val="Bibliography"/>
       </w:pPr>
       <w:r>
         <w:t xml:space="preserve">Otsuka, Yuichiro, Mikiko Tokiya, Issei Saitoh, Osamu Itani, and Yoshitaka Kaneita. 2025.</w:t>
@@ -9876,7 +9876,7 @@
     </w:p>
     <w:p>
       <w:pPr>
-        <w:pStyle w:val="BodyText"/>
+        <w:pStyle w:val="Bibliography"/>
       </w:pPr>
       <w:r>
         <w:t xml:space="preserve">Pereira, Erico F., Claudia Moreno, and Fernando M. Louzada. 2014.</w:t>
@@ -9920,7 +9920,7 @@
     </w:p>
     <w:p>
       <w:pPr>
-        <w:pStyle w:val="BodyText"/>
+        <w:pStyle w:val="Bibliography"/>
       </w:pPr>
       <w:r>
         <w:t xml:space="preserve">Pradhan, Rajesh Kumar, and Nandita Sinha. 2017.</w:t>
@@ -9964,7 +9964,7 @@
     </w:p>
     <w:p>
       <w:pPr>
-        <w:pStyle w:val="BodyText"/>
+        <w:pStyle w:val="Bibliography"/>
       </w:pPr>
       <w:ins w:id="264" w:author="Revision" w:date="2026-08-25T00:00:00Z">
         <w:r>
@@ -10010,7 +10010,7 @@
     </w:p>
     <w:p>
       <w:pPr>
-        <w:pStyle w:val="BodyText"/>
+        <w:pStyle w:val="Bibliography"/>
       </w:pPr>
       <w:r>
         <w:t xml:space="preserve">Riordan, S., M. Jopling, and S. Starr. 2021.</w:t>
@@ -10045,7 +10045,7 @@
     </w:p>
     <w:p>
       <w:pPr>
-        <w:pStyle w:val="BodyText"/>
+        <w:pStyle w:val="Bibliography"/>
       </w:pPr>
       <w:r>
         <w:t xml:space="preserve">Ross, A., C. Lessof, R. Brind-Kantar, R. Khandker, and D. Aitken. 2020.</w:t>
@@ -10080,7 +10080,7 @@
     </w:p>
     <w:p>
       <w:pPr>
-        <w:pStyle w:val="BodyText"/>
+        <w:pStyle w:val="Bibliography"/>
       </w:pPr>
       <w:r>
         <w:t xml:space="preserve">Shah, Kajal B. 2023.</w:t>
@@ -10114,7 +10114,7 @@
     </w:p>
     <w:p>
       <w:pPr>
-        <w:pStyle w:val="BodyText"/>
+        <w:pStyle w:val="Bibliography"/>
       </w:pPr>
       <w:ins w:id="265" w:author="Revision" w:date="2026-08-25T00:00:00Z">
         <w:r>
@@ -10137,7 +10137,7 @@
     </w:p>
     <w:p>
       <w:pPr>
-        <w:pStyle w:val="BodyText"/>
+        <w:pStyle w:val="Bibliography"/>
       </w:pPr>
       <w:r>
         <w:t xml:space="preserve">Snijders, T. A. B. 2012.</w:t>
@@ -10158,7 +10158,7 @@
     </w:p>
     <w:p>
       <w:pPr>
-        <w:pStyle w:val="BodyText"/>
+        <w:pStyle w:val="Bibliography"/>
       </w:pPr>
       <w:r>
         <w:t xml:space="preserve">Stein, Marc L., Julia Burdick-Will, and Jeffrey Grigg. 2021.</w:t>
@@ -10202,7 +10202,7 @@
     </w:p>
     <w:p>
       <w:pPr>
-        <w:pStyle w:val="BodyText"/>
+        <w:pStyle w:val="Bibliography"/>
       </w:pPr>
       <w:r>
         <w:t xml:space="preserve">Stopforth, Sarah, and Vernon Gayle. 2025.</w:t>
@@ -10246,7 +10246,7 @@
     </w:p>
     <w:p>
       <w:pPr>
-        <w:pStyle w:val="BodyText"/>
+        <w:pStyle w:val="Bibliography"/>
       </w:pPr>
       <w:r>
         <w:t xml:space="preserve">Strand, S. 2021.</w:t>
@@ -10281,7 +10281,7 @@
     </w:p>
     <w:p>
       <w:pPr>
-        <w:pStyle w:val="BodyText"/>
+        <w:pStyle w:val="Bibliography"/>
       </w:pPr>
       <w:r>
         <w:t xml:space="preserve">Tan, Josiah, and Adam Dennett. 2025.</w:t>
@@ -10328,7 +10328,7 @@
     </w:p>
     <w:p>
       <w:pPr>
-        <w:pStyle w:val="BodyText"/>
+        <w:pStyle w:val="Bibliography"/>
       </w:pPr>
       <w:ins w:id="266" w:author="Revision" w:date="2026-08-25T00:00:00Z">
         <w:r>
@@ -10351,7 +10351,7 @@
     </w:p>
     <w:p>
       <w:pPr>
-        <w:pStyle w:val="BodyText"/>
+        <w:pStyle w:val="Bibliography"/>
       </w:pPr>
       <w:r>
         <w:t xml:space="preserve">Thomson, Dave. 2023.</w:t>
@@ -10398,7 +10398,7 @@
     </w:p>
     <w:p>
       <w:pPr>
-        <w:pStyle w:val="BodyText"/>
+        <w:pStyle w:val="Bibliography"/>
       </w:pPr>
       <w:r>
         <w:t xml:space="preserve">Tuckett, S., E. Hunt, D. Robinson, and N. Babbini. 2023.</w:t>
@@ -10433,7 +10433,7 @@
     </w:p>
     <w:p>
       <w:pPr>
-        <w:pStyle w:val="BodyText"/>
+        <w:pStyle w:val="Bibliography"/>
       </w:pPr>
       <w:r>
         <w:t xml:space="preserve">Voulgaris, Carole Turley, Michael J. Smart, and Brian D. Taylor. 2019.</w:t>
@@ -10477,7 +10477,7 @@
     </w:p>
     <w:p>
       <w:pPr>
-        <w:pStyle w:val="BodyText"/>
+        <w:pStyle w:val="Bibliography"/>
       </w:pPr>
       <w:ins w:id="267" w:author="Revision" w:date="2026-08-25T00:00:00Z">
         <w:r>
@@ -10523,7 +10523,7 @@
     </w:p>
     <w:p>
       <w:pPr>
-        <w:pStyle w:val="BodyText"/>
+        <w:pStyle w:val="Bibliography"/>
       </w:pPr>
       <w:r>
         <w:t xml:space="preserve">Yeo, Sing Chen, Anna Mini Jos, Christina Erwin, et al. 2019.</w:t>
@@ -10567,7 +10567,7 @@
     </w:p>
     <w:p>
       <w:pPr>
-        <w:pStyle w:val="BodyText"/>
+        <w:pStyle w:val="Bibliography"/>
       </w:pPr>
       <w:r>
         <w:t xml:space="preserve">Zuccollo, J., J. Cardim Dias, E. Jimenez, and N. Braakmann. 2023.</w:t>

</xml_diff>